<commit_message>
refactor docx names again
</commit_message>
<xml_diff>
--- a/docx/Professional_self-assessment.docx
+++ b/docx/Professional_self-assessment.docx
@@ -178,21 +178,7 @@
         <w:rPr>
           <w:rFonts w:ascii="Calibri" w:hAnsi="Calibri" w:cs="Calibri"/>
         </w:rPr>
-        <w:t xml:space="preserve"> studying and applying skills such as implementing default-</w:t>
-      </w:r>
-      <w:proofErr w:type="gramStart"/>
-      <w:r>
-        <w:rPr>
-          <w:rFonts w:ascii="Calibri" w:hAnsi="Calibri" w:cs="Calibri"/>
-        </w:rPr>
-        <w:t>deny</w:t>
-      </w:r>
-      <w:proofErr w:type="gramEnd"/>
-      <w:r>
-        <w:rPr>
-          <w:rFonts w:ascii="Calibri" w:hAnsi="Calibri" w:cs="Calibri"/>
-        </w:rPr>
-        <w:t xml:space="preserve"> policies and sanitizing user-provided input</w:t>
+        <w:t xml:space="preserve"> studying and applying skills such as implementing default-deny policies and sanitizing user-provided input</w:t>
       </w:r>
       <w:r>
         <w:rPr>
@@ -822,21 +808,7 @@
         <w:rPr>
           <w:rFonts w:ascii="Calibri" w:hAnsi="Calibri" w:cs="Calibri"/>
         </w:rPr>
-        <w:t xml:space="preserve">I have resolved to pursue a career in web application development, as a </w:t>
-      </w:r>
-      <w:proofErr w:type="gramStart"/>
-      <w:r>
-        <w:rPr>
-          <w:rFonts w:ascii="Calibri" w:hAnsi="Calibri" w:cs="Calibri"/>
-        </w:rPr>
-        <w:t>back-end</w:t>
-      </w:r>
-      <w:proofErr w:type="gramEnd"/>
-      <w:r>
-        <w:rPr>
-          <w:rFonts w:ascii="Calibri" w:hAnsi="Calibri" w:cs="Calibri"/>
-        </w:rPr>
-        <w:t xml:space="preserve"> or full-stack developer. Whether my professional work will be </w:t>
+        <w:t xml:space="preserve">I have resolved to pursue a career in web application development, as a back-end or full-stack developer. Whether my professional work will be </w:t>
       </w:r>
       <w:r>
         <w:rPr>
@@ -1006,14 +978,7 @@
           <w:rFonts w:ascii="Calibri" w:hAnsi="Calibri" w:cs="Calibri"/>
         </w:rPr>
         <w:lastRenderedPageBreak/>
-        <w:t xml:space="preserve">authored a README file to instruct the user on when and how to run the script. As the original artifact only ever invoked </w:t>
-      </w:r>
-      <w:proofErr w:type="gramStart"/>
-      <w:r>
-        <w:rPr>
-          <w:rFonts w:ascii="Calibri" w:hAnsi="Calibri" w:cs="Calibri"/>
-        </w:rPr>
-        <w:t xml:space="preserve">the </w:t>
+        <w:t xml:space="preserve">authored a README file to instruct the user on when and how to run the script. As the original artifact only ever invoked the </w:t>
       </w:r>
       <w:r>
         <w:rPr>
@@ -1021,74 +986,49 @@
           <w:sz w:val="20"/>
           <w:szCs w:val="20"/>
         </w:rPr>
-        <w:t>.read</w:t>
-      </w:r>
-      <w:proofErr w:type="gramEnd"/>
+        <w:t>.read()</w:t>
+      </w:r>
+      <w:r>
+        <w:rPr>
+          <w:rFonts w:ascii="Calibri" w:hAnsi="Calibri" w:cs="Calibri"/>
+        </w:rPr>
+        <w:t xml:space="preserve"> method of the CRUD module, I expanded the dashboard functionality to allow users to alter a selected record's values in two fields - </w:t>
+      </w:r>
+      <w:proofErr w:type="spellStart"/>
+      <w:r>
+        <w:rPr>
+          <w:rFonts w:ascii="Calibri" w:hAnsi="Calibri" w:cs="Calibri"/>
+        </w:rPr>
+        <w:t>outcome_type</w:t>
+      </w:r>
+      <w:proofErr w:type="spellEnd"/>
+      <w:r>
+        <w:rPr>
+          <w:rFonts w:ascii="Calibri" w:hAnsi="Calibri" w:cs="Calibri"/>
+        </w:rPr>
+        <w:t xml:space="preserve"> and </w:t>
+      </w:r>
+      <w:proofErr w:type="spellStart"/>
+      <w:r>
+        <w:rPr>
+          <w:rFonts w:ascii="Calibri" w:hAnsi="Calibri" w:cs="Calibri"/>
+        </w:rPr>
+        <w:t>outcome_subtype</w:t>
+      </w:r>
+      <w:proofErr w:type="spellEnd"/>
+      <w:r>
+        <w:rPr>
+          <w:rFonts w:ascii="Calibri" w:hAnsi="Calibri" w:cs="Calibri"/>
+        </w:rPr>
+        <w:t xml:space="preserve"> - thereby demonstrating the functionality of the CRUD module's </w:t>
+      </w:r>
       <w:r>
         <w:rPr>
           <w:rFonts w:ascii="Consolas" w:hAnsi="Consolas" w:cs="Calibri"/>
           <w:sz w:val="20"/>
           <w:szCs w:val="20"/>
         </w:rPr>
-        <w:t>()</w:t>
-      </w:r>
-      <w:r>
-        <w:rPr>
-          <w:rFonts w:ascii="Calibri" w:hAnsi="Calibri" w:cs="Calibri"/>
-        </w:rPr>
-        <w:t xml:space="preserve"> method of the CRUD module, I expanded the dashboard functionality to allow users to alter a selected record's values in two fields - </w:t>
-      </w:r>
-      <w:proofErr w:type="spellStart"/>
-      <w:r>
-        <w:rPr>
-          <w:rFonts w:ascii="Calibri" w:hAnsi="Calibri" w:cs="Calibri"/>
-        </w:rPr>
-        <w:t>outcome_type</w:t>
-      </w:r>
-      <w:proofErr w:type="spellEnd"/>
-      <w:r>
-        <w:rPr>
-          <w:rFonts w:ascii="Calibri" w:hAnsi="Calibri" w:cs="Calibri"/>
-        </w:rPr>
-        <w:t xml:space="preserve"> and </w:t>
-      </w:r>
-      <w:proofErr w:type="spellStart"/>
-      <w:r>
-        <w:rPr>
-          <w:rFonts w:ascii="Calibri" w:hAnsi="Calibri" w:cs="Calibri"/>
-        </w:rPr>
-        <w:t>outcome_subtype</w:t>
-      </w:r>
-      <w:proofErr w:type="spellEnd"/>
-      <w:r>
-        <w:rPr>
-          <w:rFonts w:ascii="Calibri" w:hAnsi="Calibri" w:cs="Calibri"/>
-        </w:rPr>
-        <w:t xml:space="preserve"> - thereby demonstrating the functionality of the CRUD </w:t>
-      </w:r>
-      <w:proofErr w:type="gramStart"/>
-      <w:r>
-        <w:rPr>
-          <w:rFonts w:ascii="Calibri" w:hAnsi="Calibri" w:cs="Calibri"/>
-        </w:rPr>
-        <w:t xml:space="preserve">module's </w:t>
-      </w:r>
-      <w:r>
-        <w:rPr>
-          <w:rFonts w:ascii="Consolas" w:hAnsi="Consolas" w:cs="Calibri"/>
-          <w:sz w:val="20"/>
-          <w:szCs w:val="20"/>
-        </w:rPr>
-        <w:t>.update</w:t>
-      </w:r>
-      <w:proofErr w:type="gramEnd"/>
-      <w:r>
-        <w:rPr>
-          <w:rFonts w:ascii="Consolas" w:hAnsi="Consolas" w:cs="Calibri"/>
-          <w:sz w:val="20"/>
-          <w:szCs w:val="20"/>
-        </w:rPr>
-        <w:t>()</w:t>
+        <w:t>.update()</w:t>
       </w:r>
       <w:r>
         <w:rPr>
@@ -1220,21 +1160,7 @@
         <w:rPr>
           <w:rFonts w:ascii="Calibri" w:hAnsi="Calibri" w:cs="Calibri"/>
         </w:rPr>
-        <w:t xml:space="preserve"> of animals in place of the original animal lists, I reduced the lookup complexity of the intake method's duplicate check from O(n) to </w:t>
-      </w:r>
-      <w:proofErr w:type="gramStart"/>
-      <w:r>
-        <w:rPr>
-          <w:rFonts w:ascii="Calibri" w:hAnsi="Calibri" w:cs="Calibri"/>
-        </w:rPr>
-        <w:t>O(</w:t>
-      </w:r>
-      <w:proofErr w:type="gramEnd"/>
-      <w:r>
-        <w:rPr>
-          <w:rFonts w:ascii="Calibri" w:hAnsi="Calibri" w:cs="Calibri"/>
-        </w:rPr>
-        <w:t xml:space="preserve">1) on average; I also used this opportunity to key the map on a concatenation of the name and intake date, so that a matching name alone wouldn't cause a distinct new animal to be rejected. For the reserve method, I designed the nested collection of animals by country to narrow its traversal from every animal of that type to just a list of animals of that type in the </w:t>
+        <w:t xml:space="preserve"> of animals in place of the original animal lists, I reduced the lookup complexity of the intake method's duplicate check from O(n) to O(1) on average; I also used this opportunity to key the map on a concatenation of the name and intake date, so that a matching name alone wouldn't cause a distinct new animal to be rejected. For the reserve method, I designed the nested collection of animals by country to narrow its traversal from every animal of that type to just a list of animals of that type in the </w:t>
       </w:r>
       <w:r>
         <w:rPr>
@@ -1247,15 +1173,15 @@
     <w:p>
       <w:pPr>
         <w:spacing w:after="0" w:line="480" w:lineRule="auto"/>
-        <w:rPr>
-          <w:rFonts w:ascii="Calibri" w:hAnsi="Calibri" w:cs="Calibri"/>
-        </w:rPr>
-      </w:pPr>
-      <w:r>
-        <w:rPr>
-          <w:rFonts w:ascii="Calibri" w:hAnsi="Calibri" w:cs="Calibri"/>
-        </w:rPr>
-        <w:tab/>
+        <w:ind w:firstLine="720"/>
+        <w:rPr>
+          <w:rFonts w:ascii="Calibri" w:hAnsi="Calibri" w:cs="Calibri"/>
+        </w:rPr>
+      </w:pPr>
+      <w:r>
+        <w:rPr>
+          <w:rFonts w:ascii="Calibri" w:hAnsi="Calibri" w:cs="Calibri"/>
+        </w:rPr>
         <w:t xml:space="preserve">The Rescue Animal Intake program differs from the AAC dashboard in that its data is contained within the program during runtime, rather than relying on an external database. </w:t>
       </w:r>
       <w:r>
@@ -7810,6 +7736,7 @@
   <w:style w:type="character" w:default="1" w:styleId="DefaultParagraphFont">
     <w:name w:val="Default Paragraph Font"/>
     <w:uiPriority w:val="1"/>
+    <w:semiHidden/>
     <w:unhideWhenUsed/>
   </w:style>
   <w:style w:type="table" w:default="1" w:styleId="TableNormal">
@@ -8439,35 +8366,6 @@
 </file>
 
 <file path=customXml/item1.xml><?xml version="1.0" encoding="utf-8"?>
-<?mso-contentType ?>
-<FormTemplates xmlns="http://schemas.microsoft.com/sharepoint/v3/contenttype/forms">
-  <Display>DocumentLibraryForm</Display>
-  <Edit>DocumentLibraryForm</Edit>
-  <New>DocumentLibraryForm</New>
-</FormTemplates>
-</file>
-
-<file path=customXml/item2.xml><?xml version="1.0" encoding="utf-8"?>
-<p:properties xmlns:p="http://schemas.microsoft.com/office/2006/metadata/properties" xmlns:xsi="http://www.w3.org/2001/XMLSchema-instance" xmlns:pc="http://schemas.microsoft.com/office/infopath/2007/PartnerControls">
-  <documentManagement>
-    <lcf76f155ced4ddcb4097134ff3c332f xmlns="ff8a4b2e-b0c8-4039-a689-d1a7f36f4382">
-      <Terms xmlns="http://schemas.microsoft.com/office/infopath/2007/PartnerControls"/>
-    </lcf76f155ced4ddcb4097134ff3c332f>
-    <TaxCatchAll xmlns="f716dd8a-49a0-4c40-b209-038e1651b548" xsi:nil="true"/>
-    <Notes xmlns="ff8a4b2e-b0c8-4039-a689-d1a7f36f4382" xsi:nil="true"/>
-    <SharedWithUsers xmlns="f716dd8a-49a0-4c40-b209-038e1651b548">
-      <UserInfo>
-        <DisplayName/>
-        <AccountId xsi:nil="true"/>
-        <AccountType/>
-      </UserInfo>
-    </SharedWithUsers>
-    <MediaLengthInSeconds xmlns="ff8a4b2e-b0c8-4039-a689-d1a7f36f4382" xsi:nil="true"/>
-  </documentManagement>
-</p:properties>
-</file>
-
-<file path=customXml/item3.xml><?xml version="1.0" encoding="utf-8"?>
 <ct:contentTypeSchema xmlns:ct="http://schemas.microsoft.com/office/2006/metadata/contentType" xmlns:ma="http://schemas.microsoft.com/office/2006/metadata/properties/metaAttributes" ct:_="" ma:_="" ma:contentTypeName="Document" ma:contentTypeID="0x0101003FC679AA94041F4BA4494D199A3447AF" ma:contentTypeVersion="21" ma:contentTypeDescription="Create a new document." ma:contentTypeScope="" ma:versionID="af18a91a05722b869ee5995b826d927a">
   <xsd:schema xmlns:xsd="http://www.w3.org/2001/XMLSchema" xmlns:xs="http://www.w3.org/2001/XMLSchema" xmlns:p="http://schemas.microsoft.com/office/2006/metadata/properties" xmlns:ns2="ff8a4b2e-b0c8-4039-a689-d1a7f36f4382" xmlns:ns3="f716dd8a-49a0-4c40-b209-038e1651b548" targetNamespace="http://schemas.microsoft.com/office/2006/metadata/properties" ma:root="true" ma:fieldsID="16ac52c26b4ed56c4a5ac7f3b07c47d5" ns2:_="" ns3:_="">
     <xsd:import namespace="ff8a4b2e-b0c8-4039-a689-d1a7f36f4382"/>
@@ -8718,10 +8616,50 @@
 </ct:contentTypeSchema>
 </file>
 
+<file path=customXml/item2.xml><?xml version="1.0" encoding="utf-8"?>
+<p:properties xmlns:p="http://schemas.microsoft.com/office/2006/metadata/properties" xmlns:xsi="http://www.w3.org/2001/XMLSchema-instance" xmlns:pc="http://schemas.microsoft.com/office/infopath/2007/PartnerControls">
+  <documentManagement>
+    <lcf76f155ced4ddcb4097134ff3c332f xmlns="ff8a4b2e-b0c8-4039-a689-d1a7f36f4382">
+      <Terms xmlns="http://schemas.microsoft.com/office/infopath/2007/PartnerControls"/>
+    </lcf76f155ced4ddcb4097134ff3c332f>
+    <TaxCatchAll xmlns="f716dd8a-49a0-4c40-b209-038e1651b548" xsi:nil="true"/>
+    <Notes xmlns="ff8a4b2e-b0c8-4039-a689-d1a7f36f4382" xsi:nil="true"/>
+    <SharedWithUsers xmlns="f716dd8a-49a0-4c40-b209-038e1651b548">
+      <UserInfo>
+        <DisplayName/>
+        <AccountId xsi:nil="true"/>
+        <AccountType/>
+      </UserInfo>
+    </SharedWithUsers>
+    <MediaLengthInSeconds xmlns="ff8a4b2e-b0c8-4039-a689-d1a7f36f4382" xsi:nil="true"/>
+  </documentManagement>
+</p:properties>
+</file>
+
+<file path=customXml/item3.xml><?xml version="1.0" encoding="utf-8"?>
+<?mso-contentType ?>
+<FormTemplates xmlns="http://schemas.microsoft.com/sharepoint/v3/contenttype/forms">
+  <Display>DocumentLibraryForm</Display>
+  <Edit>DocumentLibraryForm</Edit>
+  <New>DocumentLibraryForm</New>
+</FormTemplates>
+</file>
+
 <file path=customXml/itemProps1.xml><?xml version="1.0" encoding="utf-8"?>
-<ds:datastoreItem xmlns:ds="http://schemas.openxmlformats.org/officeDocument/2006/customXml" ds:itemID="{9DF4E967-D0F2-46C6-8994-8839A244A243}">
+<ds:datastoreItem xmlns:ds="http://schemas.openxmlformats.org/officeDocument/2006/customXml" ds:itemID="{03C12E44-4EAE-4731-B235-D0A8A2622420}">
   <ds:schemaRefs>
-    <ds:schemaRef ds:uri="http://schemas.microsoft.com/sharepoint/v3/contenttype/forms"/>
+    <ds:schemaRef ds:uri="http://schemas.microsoft.com/office/2006/metadata/contentType"/>
+    <ds:schemaRef ds:uri="http://schemas.microsoft.com/office/2006/metadata/properties/metaAttributes"/>
+    <ds:schemaRef ds:uri="http://www.w3.org/2001/XMLSchema"/>
+    <ds:schemaRef ds:uri="http://schemas.microsoft.com/office/2006/metadata/properties"/>
+    <ds:schemaRef ds:uri="ff8a4b2e-b0c8-4039-a689-d1a7f36f4382"/>
+    <ds:schemaRef ds:uri="f716dd8a-49a0-4c40-b209-038e1651b548"/>
+    <ds:schemaRef ds:uri="http://schemas.microsoft.com/office/2006/documentManagement/types"/>
+    <ds:schemaRef ds:uri="http://schemas.microsoft.com/office/infopath/2007/PartnerControls"/>
+    <ds:schemaRef ds:uri="http://schemas.openxmlformats.org/package/2006/metadata/core-properties"/>
+    <ds:schemaRef ds:uri="http://purl.org/dc/elements/1.1/"/>
+    <ds:schemaRef ds:uri="http://purl.org/dc/terms/"/>
+    <ds:schemaRef ds:uri="http://schemas.microsoft.com/internal/obd"/>
   </ds:schemaRefs>
 </ds:datastoreItem>
 </file>
@@ -8738,20 +8676,9 @@
 </file>
 
 <file path=customXml/itemProps3.xml><?xml version="1.0" encoding="utf-8"?>
-<ds:datastoreItem xmlns:ds="http://schemas.openxmlformats.org/officeDocument/2006/customXml" ds:itemID="{03C12E44-4EAE-4731-B235-D0A8A2622420}">
+<ds:datastoreItem xmlns:ds="http://schemas.openxmlformats.org/officeDocument/2006/customXml" ds:itemID="{9DF4E967-D0F2-46C6-8994-8839A244A243}">
   <ds:schemaRefs>
-    <ds:schemaRef ds:uri="http://schemas.microsoft.com/office/2006/metadata/contentType"/>
-    <ds:schemaRef ds:uri="http://schemas.microsoft.com/office/2006/metadata/properties/metaAttributes"/>
-    <ds:schemaRef ds:uri="http://www.w3.org/2001/XMLSchema"/>
-    <ds:schemaRef ds:uri="http://schemas.microsoft.com/office/2006/metadata/properties"/>
-    <ds:schemaRef ds:uri="ff8a4b2e-b0c8-4039-a689-d1a7f36f4382"/>
-    <ds:schemaRef ds:uri="f716dd8a-49a0-4c40-b209-038e1651b548"/>
-    <ds:schemaRef ds:uri="http://schemas.microsoft.com/office/2006/documentManagement/types"/>
-    <ds:schemaRef ds:uri="http://schemas.microsoft.com/office/infopath/2007/PartnerControls"/>
-    <ds:schemaRef ds:uri="http://schemas.openxmlformats.org/package/2006/metadata/core-properties"/>
-    <ds:schemaRef ds:uri="http://purl.org/dc/elements/1.1/"/>
-    <ds:schemaRef ds:uri="http://purl.org/dc/terms/"/>
-    <ds:schemaRef ds:uri="http://schemas.microsoft.com/internal/obd"/>
+    <ds:schemaRef ds:uri="http://schemas.microsoft.com/sharepoint/v3/contenttype/forms"/>
   </ds:schemaRefs>
 </ds:datastoreItem>
 </file>
</xml_diff>